<commit_message>
fix(ims): compact spacing on page-2 sections to prevent definitions overflow
</commit_message>
<xml_diff>
--- a/public/ims/PRO-01-DOCUMENT-CONTROL.docx
+++ b/public/ims/PRO-01-DOCUMENT-CONTROL.docx
@@ -525,7 +525,7 @@
     </w:tbl>
     <w:p>
       <w:pPr>
-        <w:spacing w:line="360" w:lineRule="auto" w:before="240" w:after="80"/>
+        <w:spacing w:line="276" w:lineRule="auto" w:before="120" w:after="40"/>
         <w:keepLines/>
         <w:pageBreakBefore/>
       </w:pPr>
@@ -543,7 +543,7 @@
     </w:p>
     <w:p>
       <w:pPr>
-        <w:spacing w:line="360" w:lineRule="auto" w:after="80"/>
+        <w:spacing w:line="276" w:lineRule="auto" w:after="40"/>
         <w:keepLines/>
       </w:pPr>
       <w:r>
@@ -557,7 +557,7 @@
     </w:p>
     <w:p>
       <w:pPr>
-        <w:spacing w:line="360" w:lineRule="auto" w:before="240" w:after="80"/>
+        <w:spacing w:line="276" w:lineRule="auto" w:before="120" w:after="40"/>
         <w:keepLines/>
       </w:pPr>
       <w:r>
@@ -574,7 +574,7 @@
     </w:p>
     <w:p>
       <w:pPr>
-        <w:spacing w:line="360" w:lineRule="auto" w:after="80"/>
+        <w:spacing w:line="276" w:lineRule="auto" w:after="40"/>
         <w:keepLines/>
       </w:pPr>
       <w:r>
@@ -588,7 +588,7 @@
     </w:p>
     <w:p>
       <w:pPr>
-        <w:spacing w:line="360" w:lineRule="auto" w:after="80"/>
+        <w:spacing w:line="276" w:lineRule="auto" w:after="40"/>
         <w:keepLines/>
       </w:pPr>
       <w:r>
@@ -604,7 +604,7 @@
     </w:p>
     <w:p>
       <w:pPr>
-        <w:spacing w:line="360" w:lineRule="auto" w:after="80"/>
+        <w:spacing w:line="276" w:lineRule="auto" w:after="40"/>
         <w:keepLines/>
       </w:pPr>
       <w:r>
@@ -618,7 +618,7 @@
     </w:p>
     <w:p>
       <w:pPr>
-        <w:spacing w:line="360" w:lineRule="auto" w:after="80"/>
+        <w:spacing w:line="276" w:lineRule="auto" w:after="40"/>
         <w:keepLines/>
       </w:pPr>
       <w:r>
@@ -632,7 +632,7 @@
     </w:p>
     <w:p>
       <w:pPr>
-        <w:spacing w:line="360" w:lineRule="auto" w:after="80"/>
+        <w:spacing w:line="276" w:lineRule="auto" w:after="40"/>
         <w:keepLines/>
       </w:pPr>
       <w:r>
@@ -646,7 +646,7 @@
     </w:p>
     <w:p>
       <w:pPr>
-        <w:spacing w:line="360" w:lineRule="auto" w:after="80"/>
+        <w:spacing w:line="276" w:lineRule="auto" w:after="40"/>
         <w:keepLines/>
       </w:pPr>
       <w:r>
@@ -660,7 +660,7 @@
     </w:p>
     <w:p>
       <w:pPr>
-        <w:spacing w:line="360" w:lineRule="auto" w:after="80"/>
+        <w:spacing w:line="276" w:lineRule="auto" w:after="40"/>
         <w:keepLines/>
       </w:pPr>
       <w:r>
@@ -746,7 +746,7 @@
     </w:p>
     <w:p>
       <w:pPr>
-        <w:spacing w:line="360" w:lineRule="auto" w:after="80"/>
+        <w:spacing w:line="276" w:lineRule="auto" w:after="40"/>
         <w:keepLines/>
       </w:pPr>
       <w:r>
@@ -762,7 +762,7 @@
     </w:p>
     <w:p>
       <w:pPr>
-        <w:spacing w:line="360" w:lineRule="auto" w:after="80"/>
+        <w:spacing w:line="276" w:lineRule="auto" w:after="40"/>
         <w:keepLines/>
       </w:pPr>
       <w:r>
@@ -776,7 +776,7 @@
     </w:p>
     <w:p>
       <w:pPr>
-        <w:spacing w:line="360" w:lineRule="auto" w:after="80"/>
+        <w:spacing w:line="276" w:lineRule="auto" w:after="40"/>
         <w:keepLines/>
       </w:pPr>
       <w:r>
@@ -790,7 +790,7 @@
     </w:p>
     <w:p>
       <w:pPr>
-        <w:spacing w:line="360" w:lineRule="auto" w:after="80"/>
+        <w:spacing w:line="276" w:lineRule="auto" w:after="40"/>
         <w:keepLines/>
       </w:pPr>
       <w:r>
@@ -804,7 +804,7 @@
     </w:p>
     <w:p>
       <w:pPr>
-        <w:spacing w:line="360" w:lineRule="auto" w:after="80"/>
+        <w:spacing w:line="276" w:lineRule="auto" w:after="40"/>
         <w:keepLines/>
       </w:pPr>
       <w:r>
@@ -818,7 +818,7 @@
     </w:p>
     <w:p>
       <w:pPr>
-        <w:spacing w:line="360" w:lineRule="auto" w:after="80"/>
+        <w:spacing w:line="276" w:lineRule="auto" w:after="40"/>
         <w:keepLines/>
       </w:pPr>
       <w:r>
@@ -832,7 +832,7 @@
     </w:p>
     <w:p>
       <w:pPr>
-        <w:spacing w:line="360" w:lineRule="auto" w:after="80"/>
+        <w:spacing w:line="276" w:lineRule="auto" w:after="40"/>
         <w:keepLines/>
       </w:pPr>
       <w:r>
@@ -846,7 +846,7 @@
     </w:p>
     <w:p>
       <w:pPr>
-        <w:spacing w:line="360" w:lineRule="auto" w:after="80"/>
+        <w:spacing w:line="276" w:lineRule="auto" w:after="40"/>
         <w:keepLines/>
       </w:pPr>
       <w:r>
@@ -860,7 +860,7 @@
     </w:p>
     <w:p>
       <w:pPr>
-        <w:spacing w:line="360" w:lineRule="auto" w:after="80"/>
+        <w:spacing w:line="276" w:lineRule="auto" w:after="40"/>
         <w:keepLines/>
       </w:pPr>
       <w:r>
@@ -876,7 +876,7 @@
     </w:p>
     <w:p>
       <w:pPr>
-        <w:spacing w:line="360" w:lineRule="auto" w:after="80"/>
+        <w:spacing w:line="276" w:lineRule="auto" w:after="40"/>
         <w:keepLines/>
       </w:pPr>
       <w:r>
@@ -890,7 +890,7 @@
     </w:p>
     <w:p>
       <w:pPr>
-        <w:spacing w:line="360" w:lineRule="auto" w:after="80"/>
+        <w:spacing w:line="276" w:lineRule="auto" w:after="40"/>
         <w:keepLines/>
       </w:pPr>
       <w:r>
@@ -904,7 +904,7 @@
     </w:p>
     <w:p>
       <w:pPr>
-        <w:spacing w:line="360" w:lineRule="auto" w:after="80"/>
+        <w:spacing w:line="276" w:lineRule="auto" w:after="40"/>
         <w:keepLines/>
       </w:pPr>
       <w:r>
@@ -918,7 +918,7 @@
     </w:p>
     <w:p>
       <w:pPr>
-        <w:spacing w:line="360" w:lineRule="auto" w:after="80"/>
+        <w:spacing w:line="276" w:lineRule="auto" w:after="40"/>
         <w:keepLines/>
       </w:pPr>
       <w:r>
@@ -932,7 +932,7 @@
     </w:p>
     <w:p>
       <w:pPr>
-        <w:spacing w:line="360" w:lineRule="auto" w:after="80"/>
+        <w:spacing w:line="276" w:lineRule="auto" w:after="40"/>
         <w:keepLines/>
       </w:pPr>
       <w:r>
@@ -946,7 +946,7 @@
     </w:p>
     <w:p>
       <w:pPr>
-        <w:spacing w:line="360" w:lineRule="auto" w:after="80"/>
+        <w:spacing w:line="276" w:lineRule="auto" w:after="40"/>
         <w:keepLines/>
       </w:pPr>
       <w:r>
@@ -960,7 +960,7 @@
     </w:p>
     <w:p>
       <w:pPr>
-        <w:spacing w:line="360" w:lineRule="auto" w:after="80"/>
+        <w:spacing w:line="276" w:lineRule="auto" w:after="40"/>
         <w:keepLines/>
       </w:pPr>
       <w:r>
@@ -976,7 +976,7 @@
     </w:p>
     <w:p>
       <w:pPr>
-        <w:spacing w:line="360" w:lineRule="auto" w:after="80"/>
+        <w:spacing w:line="276" w:lineRule="auto" w:after="40"/>
         <w:keepLines/>
       </w:pPr>
       <w:r>
@@ -990,7 +990,7 @@
     </w:p>
     <w:p>
       <w:pPr>
-        <w:spacing w:line="360" w:lineRule="auto" w:after="80"/>
+        <w:spacing w:line="276" w:lineRule="auto" w:after="40"/>
         <w:keepLines/>
       </w:pPr>
       <w:r>
@@ -1004,7 +1004,7 @@
     </w:p>
     <w:p>
       <w:pPr>
-        <w:spacing w:line="360" w:lineRule="auto" w:after="80"/>
+        <w:spacing w:line="276" w:lineRule="auto" w:after="40"/>
         <w:keepLines/>
       </w:pPr>
       <w:r>
@@ -1018,7 +1018,7 @@
     </w:p>
     <w:p>
       <w:pPr>
-        <w:spacing w:line="360" w:lineRule="auto" w:after="80"/>
+        <w:spacing w:line="276" w:lineRule="auto" w:after="40"/>
         <w:keepLines/>
       </w:pPr>
       <w:r>
@@ -1032,7 +1032,7 @@
     </w:p>
     <w:p>
       <w:pPr>
-        <w:spacing w:line="360" w:lineRule="auto" w:after="80"/>
+        <w:spacing w:line="276" w:lineRule="auto" w:after="40"/>
         <w:keepLines/>
       </w:pPr>
       <w:r>
@@ -1046,7 +1046,7 @@
     </w:p>
     <w:p>
       <w:pPr>
-        <w:spacing w:line="360" w:lineRule="auto" w:after="80"/>
+        <w:spacing w:line="276" w:lineRule="auto" w:after="40"/>
         <w:keepLines/>
       </w:pPr>
       <w:r>
@@ -1062,7 +1062,7 @@
     </w:p>
     <w:p>
       <w:pPr>
-        <w:spacing w:line="360" w:lineRule="auto" w:after="80"/>
+        <w:spacing w:line="276" w:lineRule="auto" w:after="40"/>
         <w:keepLines/>
       </w:pPr>
       <w:r>
@@ -1076,7 +1076,7 @@
     </w:p>
     <w:p>
       <w:pPr>
-        <w:spacing w:line="360" w:lineRule="auto" w:after="80"/>
+        <w:spacing w:line="276" w:lineRule="auto" w:after="40"/>
         <w:keepLines/>
       </w:pPr>
       <w:r>
@@ -1090,7 +1090,7 @@
     </w:p>
     <w:p>
       <w:pPr>
-        <w:spacing w:line="360" w:lineRule="auto" w:after="80"/>
+        <w:spacing w:line="276" w:lineRule="auto" w:after="40"/>
         <w:keepLines/>
       </w:pPr>
       <w:r>
@@ -1104,7 +1104,7 @@
     </w:p>
     <w:p>
       <w:pPr>
-        <w:spacing w:line="360" w:lineRule="auto" w:after="80"/>
+        <w:spacing w:line="276" w:lineRule="auto" w:after="40"/>
         <w:keepLines/>
       </w:pPr>
       <w:r>
@@ -1118,7 +1118,7 @@
     </w:p>
     <w:p>
       <w:pPr>
-        <w:spacing w:line="360" w:lineRule="auto" w:after="80"/>
+        <w:spacing w:line="276" w:lineRule="auto" w:after="40"/>
         <w:keepLines/>
       </w:pPr>
       <w:r>
@@ -1132,7 +1132,7 @@
     </w:p>
     <w:p>
       <w:pPr>
-        <w:spacing w:line="360" w:lineRule="auto" w:after="80"/>
+        <w:spacing w:line="276" w:lineRule="auto" w:after="40"/>
         <w:keepLines/>
       </w:pPr>
       <w:r>
@@ -1148,7 +1148,7 @@
     </w:p>
     <w:p>
       <w:pPr>
-        <w:spacing w:line="360" w:lineRule="auto" w:after="80"/>
+        <w:spacing w:line="276" w:lineRule="auto" w:after="40"/>
         <w:keepLines/>
       </w:pPr>
       <w:r>
@@ -1162,7 +1162,7 @@
     </w:p>
     <w:p>
       <w:pPr>
-        <w:spacing w:line="360" w:lineRule="auto" w:after="80"/>
+        <w:spacing w:line="276" w:lineRule="auto" w:after="40"/>
         <w:keepLines/>
       </w:pPr>
       <w:r>
@@ -1176,7 +1176,7 @@
     </w:p>
     <w:p>
       <w:pPr>
-        <w:spacing w:line="360" w:lineRule="auto" w:after="80"/>
+        <w:spacing w:line="276" w:lineRule="auto" w:after="40"/>
         <w:keepLines/>
       </w:pPr>
       <w:r>
@@ -1190,7 +1190,7 @@
     </w:p>
     <w:p>
       <w:pPr>
-        <w:spacing w:line="360" w:lineRule="auto" w:after="80"/>
+        <w:spacing w:line="276" w:lineRule="auto" w:after="40"/>
         <w:keepLines/>
       </w:pPr>
       <w:r>
@@ -1204,7 +1204,7 @@
     </w:p>
     <w:p>
       <w:pPr>
-        <w:spacing w:line="360" w:lineRule="auto" w:after="80"/>
+        <w:spacing w:line="276" w:lineRule="auto" w:after="40"/>
         <w:keepLines/>
       </w:pPr>
       <w:r>
@@ -1220,7 +1220,7 @@
     </w:p>
     <w:p>
       <w:pPr>
-        <w:spacing w:line="360" w:lineRule="auto" w:after="80"/>
+        <w:spacing w:line="276" w:lineRule="auto" w:after="40"/>
         <w:keepLines/>
       </w:pPr>
       <w:r>
@@ -1234,7 +1234,7 @@
     </w:p>
     <w:p>
       <w:pPr>
-        <w:spacing w:line="360" w:lineRule="auto" w:after="80"/>
+        <w:spacing w:line="276" w:lineRule="auto" w:after="40"/>
         <w:keepLines/>
       </w:pPr>
       <w:r>
@@ -1248,7 +1248,7 @@
     </w:p>
     <w:p>
       <w:pPr>
-        <w:spacing w:line="360" w:lineRule="auto" w:after="80"/>
+        <w:spacing w:line="276" w:lineRule="auto" w:after="40"/>
         <w:keepLines/>
       </w:pPr>
       <w:r>
@@ -1262,7 +1262,7 @@
     </w:p>
     <w:p>
       <w:pPr>
-        <w:spacing w:line="360" w:lineRule="auto" w:after="80"/>
+        <w:spacing w:line="276" w:lineRule="auto" w:after="40"/>
         <w:keepLines/>
       </w:pPr>
       <w:r>
@@ -1276,7 +1276,7 @@
     </w:p>
     <w:p>
       <w:pPr>
-        <w:spacing w:line="360" w:lineRule="auto" w:after="80"/>
+        <w:spacing w:line="276" w:lineRule="auto" w:after="40"/>
         <w:keepLines/>
       </w:pPr>
       <w:r>
@@ -1290,7 +1290,7 @@
     </w:p>
     <w:p>
       <w:pPr>
-        <w:spacing w:line="360" w:lineRule="auto" w:after="80"/>
+        <w:spacing w:line="276" w:lineRule="auto" w:after="40"/>
         <w:keepLines/>
       </w:pPr>
       <w:r>
@@ -1304,7 +1304,7 @@
     </w:p>
     <w:p>
       <w:pPr>
-        <w:spacing w:line="360" w:lineRule="auto" w:after="80"/>
+        <w:spacing w:line="276" w:lineRule="auto" w:after="40"/>
         <w:keepLines/>
       </w:pPr>
       <w:r>
@@ -1318,7 +1318,7 @@
     </w:p>
     <w:p>
       <w:pPr>
-        <w:spacing w:line="360" w:lineRule="auto" w:after="80"/>
+        <w:spacing w:line="276" w:lineRule="auto" w:after="40"/>
         <w:keepLines/>
       </w:pPr>
       <w:r>
@@ -1332,7 +1332,7 @@
     </w:p>
     <w:p>
       <w:pPr>
-        <w:spacing w:line="360" w:lineRule="auto" w:after="80"/>
+        <w:spacing w:line="276" w:lineRule="auto" w:after="40"/>
         <w:keepLines/>
       </w:pPr>
       <w:r>
@@ -1346,7 +1346,7 @@
     </w:p>
     <w:p>
       <w:pPr>
-        <w:spacing w:line="360" w:lineRule="auto" w:before="240" w:after="80"/>
+        <w:spacing w:line="276" w:lineRule="auto" w:before="120" w:after="40"/>
         <w:keepLines/>
       </w:pPr>
       <w:r>
@@ -1363,7 +1363,7 @@
     </w:p>
     <w:p>
       <w:pPr>
-        <w:spacing w:line="360" w:lineRule="auto" w:after="80"/>
+        <w:spacing w:line="276" w:lineRule="auto" w:after="40"/>
         <w:keepLines/>
       </w:pPr>
       <w:r>
@@ -1387,7 +1387,7 @@
     </w:p>
     <w:p>
       <w:pPr>
-        <w:spacing w:line="360" w:lineRule="auto" w:after="80"/>
+        <w:spacing w:line="276" w:lineRule="auto" w:after="40"/>
         <w:keepLines/>
       </w:pPr>
       <w:r>
@@ -1411,7 +1411,7 @@
     </w:p>
     <w:p>
       <w:pPr>
-        <w:spacing w:line="360" w:lineRule="auto" w:after="80"/>
+        <w:spacing w:line="276" w:lineRule="auto" w:after="40"/>
         <w:keepLines/>
       </w:pPr>
       <w:r>
@@ -1435,7 +1435,7 @@
     </w:p>
     <w:p>
       <w:pPr>
-        <w:spacing w:line="360" w:lineRule="auto" w:after="80"/>
+        <w:spacing w:line="276" w:lineRule="auto" w:after="40"/>
         <w:keepLines/>
       </w:pPr>
       <w:r>
@@ -1459,7 +1459,7 @@
     </w:p>
     <w:p>
       <w:pPr>
-        <w:spacing w:line="360" w:lineRule="auto" w:before="240" w:after="80"/>
+        <w:spacing w:line="276" w:lineRule="auto" w:before="120" w:after="40"/>
         <w:keepLines/>
       </w:pPr>
       <w:r>

</xml_diff>